<commit_message>
paper: deposit CSD refcode manifest (identifiers + bibliographic metadata only, not licensed structural data); rewrite Data Availability Statement to stop gating it behind 'on request'
</commit_message>
<xml_diff>
--- a/paper/data_availability/data_availability_statement.docx
+++ b/paper/data_availability/data_availability_statement.docx
@@ -50,31 +50,79 @@
         <w:pStyle w:val="BodyText"/>
       </w:pPr>
       <w:r>
-        <w:t xml:space="preserve">The CSD entries used cannot be redistributed under the CSD licence. A manifest</w:t>
-      </w:r>
-      <w:r>
-        <w:t xml:space="preserve"> </w:t>
-      </w:r>
-      <w:r>
-        <w:t xml:space="preserve">of refcodes and all derived, non-redistributable quantities required to</w:t>
-      </w:r>
-      <w:r>
-        <w:t xml:space="preserve"> </w:t>
-      </w:r>
-      <w:r>
-        <w:t xml:space="preserve">reproduce the analyses are available from the author on request, and the dataset</w:t>
-      </w:r>
-      <w:r>
-        <w:t xml:space="preserve"> </w:t>
-      </w:r>
-      <w:r>
-        <w:t xml:space="preserve">can be regenerated from the manifest with the released code against a licensed</w:t>
-      </w:r>
-      <w:r>
-        <w:t xml:space="preserve"> </w:t>
-      </w:r>
-      <w:r>
-        <w:t xml:space="preserve">CSD installation.</w:t>
+        <w:t xml:space="preserve">The CIF structures underlying this study are drawn from the Cambridge</w:t>
+      </w:r>
+      <w:r>
+        <w:t xml:space="preserve"> </w:t>
+      </w:r>
+      <w:r>
+        <w:t xml:space="preserve">Structural Database (CSD) and cannot be redistributed under the CSD licence.</w:t>
+      </w:r>
+      <w:r>
+        <w:t xml:space="preserve"> </w:t>
+      </w:r>
+      <w:r>
+        <w:t xml:space="preserve">The manifest of refcodes and filter protocol used to select the corpus</w:t>
+      </w:r>
+      <w:r>
+        <w:t xml:space="preserve"> </w:t>
+      </w:r>
+      <w:r>
+        <w:t xml:space="preserve">(3,501 candidate entries; formula, Z’, R-factor, atom count, and space group</w:t>
+      </w:r>
+      <w:r>
+        <w:t xml:space="preserve"> </w:t>
+      </w:r>
+      <w:r>
+        <w:t xml:space="preserve">per entry) is openly available at</w:t>
+      </w:r>
+      <w:r>
+        <w:t xml:space="preserve"> </w:t>
+      </w:r>
+      <w:r>
+        <w:t xml:space="preserve">https://github.com/fronkt/symmc-flow/blob/master/data/csd_mol/manifest.csv</w:t>
+      </w:r>
+      <w:r>
+        <w:t xml:space="preserve"> </w:t>
+      </w:r>
+      <w:r>
+        <w:t xml:space="preserve">and lets anyone with a licensed CSD installation regenerate the exact CIF</w:t>
+      </w:r>
+      <w:r>
+        <w:t xml:space="preserve"> </w:t>
+      </w:r>
+      <w:r>
+        <w:t xml:space="preserve">corpus via</w:t>
+      </w:r>
+      <w:r>
+        <w:t xml:space="preserve"> </w:t>
+      </w:r>
+      <w:r>
+        <w:rPr>
+          <w:rStyle w:val="VerbatimChar"/>
+        </w:rPr>
+        <w:t xml:space="preserve">scripts/csd_export.py</w:t>
+      </w:r>
+      <w:r>
+        <w:t xml:space="preserve">. The factorized dataset (lattice, centroid,</w:t>
+      </w:r>
+      <w:r>
+        <w:t xml:space="preserve"> </w:t>
+      </w:r>
+      <w:r>
+        <w:t xml:space="preserve">and orientation tensors derived from the CIFs) is itself derived from the</w:t>
+      </w:r>
+      <w:r>
+        <w:t xml:space="preserve"> </w:t>
+      </w:r>
+      <w:r>
+        <w:t xml:space="preserve">licensed structures and is therefore available from the author on reasonable</w:t>
+      </w:r>
+      <w:r>
+        <w:t xml:space="preserve"> </w:t>
+      </w:r>
+      <w:r>
+        <w:t xml:space="preserve">request, subject to the requester holding a CSD licence.</w:t>
       </w:r>
     </w:p>
     <w:p>

</xml_diff>